<commit_message>
Say when a RatesFile is a shortened path or a Share link
SharePoint shortens long paths on screen with "…", and a Share link
does not say where a file is. Either one in the register's RatesFile
can never be fetched; the app now says which it is and how to copy the
full address, without asking the flow. Also drops a doubled full stop
from the could-not-load message.

Co-Authored-By: Claude Opus 5.5 <noreply@anthropic.com>
Claude-Session: https://claude.ai/code/session_0179JD8tKBuQw572uHNzHE2b
</commit_message>
<xml_diff>
--- a/docs/word/11 - Agreed Schedules of Rates.docx
+++ b/docs/word/11 - Agreed Schedules of Rates.docx
@@ -1399,6 +1399,78 @@
           <w:szCs w:val="20"/>
         </w:rPr>
         <w:t xml:space="preserve"> link, which is a different kind of address</w:t>
+      </w:r>
+    </w:p>
+    <w:p>
+      <w:pPr>
+        <w:spacing w:after="160" w:line="276"/>
+      </w:pPr>
+      <w:r>
+        <w:rPr>
+          <w:rFonts w:ascii="Arial" w:cs="Arial" w:eastAsia="Arial" w:hAnsi="Arial"/>
+          <w:color w:val="1C2B3A"/>
+          <w:sz w:val="20"/>
+          <w:szCs w:val="20"/>
+        </w:rPr>
+        <w:t xml:space="preserve">Copy it with the copy button beside </w:t>
+      </w:r>
+      <w:r>
+        <w:rPr>
+          <w:rFonts w:ascii="Arial" w:cs="Arial" w:eastAsia="Arial" w:hAnsi="Arial"/>
+          <w:b/>
+          <w:bCs/>
+          <w:color w:val="1C2B3A"/>
+          <w:sz w:val="20"/>
+          <w:szCs w:val="20"/>
+        </w:rPr>
+        <w:t xml:space="preserve">Path</w:t>
+      </w:r>
+      <w:r>
+        <w:rPr>
+          <w:rFonts w:ascii="Arial" w:cs="Arial" w:eastAsia="Arial" w:hAnsi="Arial"/>
+          <w:color w:val="1C2B3A"/>
+          <w:sz w:val="20"/>
+          <w:szCs w:val="20"/>
+        </w:rPr>
+        <w:t xml:space="preserve">, not by selecting the text you can see: SharePoint shortens a long path on screen to </w:t>
+      </w:r>
+      <w:r>
+        <w:rPr>
+          <w:rFonts w:ascii="Consolas" w:cs="Consolas" w:eastAsia="Consolas" w:hAnsi="Consolas"/>
+          <w:color w:val="2A4258"/>
+          <w:sz w:val="18"/>
+          <w:szCs w:val="18"/>
+          <w:shd w:fill="F2F0EA" w:val="clear"/>
+        </w:rPr>
+        <w:t xml:space="preserve">/Shared Documents/15.Projects_VIC/…/Schedule of Rates.xlsx</w:t>
+      </w:r>
+      <w:r>
+        <w:rPr>
+          <w:rFonts w:ascii="Arial" w:cs="Arial" w:eastAsia="Arial" w:hAnsi="Arial"/>
+          <w:color w:val="1C2B3A"/>
+          <w:sz w:val="20"/>
+          <w:szCs w:val="20"/>
+        </w:rPr>
+        <w:t xml:space="preserve">, and a path with </w:t>
+      </w:r>
+      <w:r>
+        <w:rPr>
+          <w:rFonts w:ascii="Consolas" w:cs="Consolas" w:eastAsia="Consolas" w:hAnsi="Consolas"/>
+          <w:color w:val="2A4258"/>
+          <w:sz w:val="18"/>
+          <w:szCs w:val="18"/>
+          <w:shd w:fill="F2F0EA" w:val="clear"/>
+        </w:rPr>
+        <w:t xml:space="preserve">…</w:t>
+      </w:r>
+      <w:r>
+        <w:rPr>
+          <w:rFonts w:ascii="Arial" w:cs="Arial" w:eastAsia="Arial" w:hAnsi="Arial"/>
+          <w:color w:val="1C2B3A"/>
+          <w:sz w:val="20"/>
+          <w:szCs w:val="20"/>
+        </w:rPr>
+        <w:t xml:space="preserve"> in it points at a folder that does not exist. The app says so if the register holds one, rather than asking the flow.</w:t>
       </w:r>
     </w:p>
     <w:p>

</xml_diff>

<commit_message>
Read the agreed rates when the flow sends the workbook itself
A Response whose Body is the Get file content output sends the file's
bytes, not JSON, and the app refused it. It now takes the workbook as
it comes (or a .csv), as well as JSON carrying it in base64. The Netlify
proxy passes a file through base64-encoded instead of reading it as
text, which would have mangled it.

Co-Authored-By: Claude Opus 5.5 <noreply@anthropic.com>
Claude-Session: https://claude.ai/code/session_0179JD8tKBuQw572uHNzHE2b
</commit_message>
<xml_diff>
--- a/docs/word/11 - Agreed Schedules of Rates.docx
+++ b/docs/word/11 - Agreed Schedules of Rates.docx
@@ -2518,25 +2518,6 @@
           <w:sz w:val="20"/>
           <w:szCs w:val="20"/>
         </w:rPr>
-        <w:t xml:space="preserve">, body </w:t>
-      </w:r>
-      <w:r>
-        <w:rPr>
-          <w:rFonts w:ascii="Consolas" w:cs="Consolas" w:eastAsia="Consolas" w:hAnsi="Consolas"/>
-          <w:color w:val="2A4258"/>
-          <w:sz w:val="18"/>
-          <w:szCs w:val="18"/>
-          <w:shd w:fill="F2F0EA" w:val="clear"/>
-        </w:rPr>
-        <w:t xml:space="preserve">@{body('Get_file_content_using_path')}</w:t>
-      </w:r>
-      <w:r>
-        <w:rPr>
-          <w:rFonts w:ascii="Arial" w:cs="Arial" w:eastAsia="Arial" w:hAnsi="Arial"/>
-          <w:color w:val="1C2B3A"/>
-          <w:sz w:val="20"/>
-          <w:szCs w:val="20"/>
-        </w:rPr>
         <w:t xml:space="preserve">, with the same two headers as flow 1 (</w:t>
       </w:r>
       <w:r>
@@ -2557,7 +2538,86 @@
           <w:sz w:val="20"/>
           <w:szCs w:val="20"/>
         </w:rPr>
-        <w:t xml:space="preserve">).</w:t>
+        <w:t xml:space="preserve">). For its </w:t>
+      </w:r>
+      <w:r>
+        <w:rPr>
+          <w:rFonts w:ascii="Arial" w:cs="Arial" w:eastAsia="Arial" w:hAnsi="Arial"/>
+          <w:b/>
+          <w:bCs/>
+          <w:color w:val="1C2B3A"/>
+          <w:sz w:val="20"/>
+          <w:szCs w:val="20"/>
+        </w:rPr>
+        <w:t xml:space="preserve">Body</w:t>
+      </w:r>
+      <w:r>
+        <w:rPr>
+          <w:rFonts w:ascii="Arial" w:cs="Arial" w:eastAsia="Arial" w:hAnsi="Arial"/>
+          <w:color w:val="1C2B3A"/>
+          <w:sz w:val="20"/>
+          <w:szCs w:val="20"/>
+        </w:rPr>
+        <w:t xml:space="preserve">, pick </w:t>
+      </w:r>
+      <w:r>
+        <w:rPr>
+          <w:rFonts w:ascii="Arial" w:cs="Arial" w:eastAsia="Arial" w:hAnsi="Arial"/>
+          <w:b/>
+          <w:bCs/>
+          <w:color w:val="1C2B3A"/>
+          <w:sz w:val="20"/>
+          <w:szCs w:val="20"/>
+        </w:rPr>
+        <w:t xml:space="preserve">File Content</w:t>
+      </w:r>
+      <w:r>
+        <w:rPr>
+          <w:rFonts w:ascii="Arial" w:cs="Arial" w:eastAsia="Arial" w:hAnsi="Arial"/>
+          <w:color w:val="1C2B3A"/>
+          <w:sz w:val="20"/>
+          <w:szCs w:val="20"/>
+        </w:rPr>
+        <w:t xml:space="preserve"> (from </w:t>
+      </w:r>
+      <w:r>
+        <w:rPr>
+          <w:rFonts w:ascii="Arial" w:cs="Arial" w:eastAsia="Arial" w:hAnsi="Arial"/>
+          <w:i/>
+          <w:iCs/>
+          <w:color w:val="1C2B3A"/>
+          <w:sz w:val="20"/>
+          <w:szCs w:val="20"/>
+        </w:rPr>
+        <w:t xml:space="preserve">Get file content using path</w:t>
+      </w:r>
+      <w:r>
+        <w:rPr>
+          <w:rFonts w:ascii="Arial" w:cs="Arial" w:eastAsia="Arial" w:hAnsi="Arial"/>
+          <w:color w:val="1C2B3A"/>
+          <w:sz w:val="20"/>
+          <w:szCs w:val="20"/>
+        </w:rPr>
+        <w:t xml:space="preserve">) from the dynamic content list. The flow then sends the workbook itself, which the app reads as it is. JSON with the file in base64 also works, if you would rather:</w:t>
+      </w:r>
+    </w:p>
+    <w:p>
+      <w:pPr>
+        <w:pBdr>
+          <w:left w:val="single" w:color="4C5C6D" w:sz="12" w:space="8"/>
+        </w:pBdr>
+        <w:shd w:fill="F2F0EA" w:val="clear"/>
+        <w:spacing w:after="160" w:before="120"/>
+        <w:ind w:left="220" w:right="220"/>
+      </w:pPr>
+      <w:r>
+        <w:rPr>
+          <w:rFonts w:ascii="Consolas" w:cs="Consolas" w:eastAsia="Consolas" w:hAnsi="Consolas"/>
+          <w:color w:val="1C2B3A"/>
+          <w:sz w:val="17"/>
+          <w:szCs w:val="17"/>
+        </w:rPr>
+        <w:t xml:space="preserve">{ "file": "@{base64(body('Get_file_content_using_path'))}" }</w:t>
       </w:r>
     </w:p>
     <w:p>

</xml_diff>